<commit_message>
docs: name the validation section so it can be found, and stop saying the data is "arriving"
Merve could not find the validation work in the document. Two reasons, both mine.

The section was titled "The first external check, and what it found" - accurate,
but it does not contain the word anybody would search for. It is now
"5. VALIDATION - our answer against what people said about themselves".

And 4.2 still read "The survey answers (arriving now)" with a body in the future
tense, three sections above the results. Anybody skimming would conclude the data
had not arrived. Both now say it has, with the headline figure and a pointer to
section 5.

Also a note on method: the earlier patch used str.replace with no assertion, so a
pattern that did not match failed silently and left the stale text in place. Every
edit in this one asserts first. That is what produced the confusion.

Co-Authored-By: Claude Opus 5 (1M context) <noreply@anthropic.com>
</commit_message>
<xml_diff>
--- a/orcid_role_identifier/docs/ORCID-Role-Enrichment-Status-and-Plan.docx
+++ b/orcid_role_identifier/docs/ORCID-Role-Enrichment-Status-and-Plan.docx
@@ -2983,7 +2983,7 @@
           <w:color w:val="1F6F6A"/>
           <w:sz w:val="25"/>
         </w:rPr>
-        <w:t>4.2  The survey answers (arriving now)</w:t>
+        <w:t>4.2  The survey answers — ARRIVED, and measured in section 5</w:t>
       </w:r>
     </w:p>
     <w:p>
@@ -3214,7 +3214,7 @@
           <w:color w:val="464B52"/>
           <w:sz w:val="21"/>
         </w:rPr>
-        <w:t>This is the first time we can compare our answer to the person's own answer.</w:t>
+        <w:t>Both exports arrived on 30 October and have been used.</w:t>
       </w:r>
       <w:r>
         <w:rPr>
@@ -3224,7 +3224,7 @@
           <w:color w:val="464B52"/>
           <w:sz w:val="21"/>
         </w:rPr>
-        <w:t xml:space="preserve"> An early match on a smaller slice already found 24,068 people in common.</w:t>
+        <w:t xml:space="preserve"> 290,045 unique people after deduplication, 93.2% of whom could be mapped onto one of our ten professions. The full result is section 5. The headline: 81.8% of the people we classified were put in the audience they put themselves in, against a ceiling of 88.9%.</w:t>
       </w:r>
     </w:p>
     <w:tbl>
@@ -3393,7 +3393,7 @@
           <w:color w:val="1C1F23"/>
           <w:sz w:val="32"/>
         </w:rPr>
-        <w:t>5.  The first external check, and what it found</w:t>
+        <w:t>5.  VALIDATION — our answer against what people said about themselves</w:t>
       </w:r>
     </w:p>
     <w:p>

</xml_diff>

<commit_message>
docs: Head of Faculty grows for the first time, by 8.5%
The status document and 1.10b now carry the shipped numbers rather than the
superseded +19%: faculty_head 17,528 -> 19,026 against Lecturer 399,884 ->
398,858, and the two things only the build can settle.

Co-Authored-By: Claude Opus 5 (1M context) <noreply@anthropic.com>
</commit_message>
<xml_diff>
--- a/orcid_role_identifier/docs/ORCID-Role-Enrichment-Status-and-Plan.docx
+++ b/orcid_role_identifier/docs/ORCID-Role-Enrichment-Status-and-Plan.docx
@@ -405,7 +405,7 @@
                 <w:color w:val="464B52"/>
                 <w:sz w:val="20"/>
               </w:rPr>
-              <w:t>And the route that could grow Head of Faculty has been measured, and the obvious implementation was rejected on the measurement.</w:t>
+              <w:t>Head of Faculty grows for the first time, by 8.5%.</w:t>
             </w:r>
             <w:r>
               <w:rPr>
@@ -414,7 +414,7 @@
                 <w:color w:val="464B52"/>
                 <w:sz w:val="20"/>
               </w:rPr>
-              <w:t xml:space="preserve"> The compounds would cost Lecturer at most 1,739 people (0.43%) and gain up to 3,376 (+19%). But a pattern for them would also sweep 14,500 records out of eight other groups — including 2.7% of the whole pharmacist group — because </w:t>
+              <w:t xml:space="preserve"> The professor-plus-leadership compounds now reach it: 1,498 new confirmed people against 1,026 leaving Lecturer, which is 0.26% of that audience. It took a new mechanism — a pattern scoped to one group — because an unscoped one would have swept 14,500 records out of eight other groups, including 2.7% of the whole pharmacist group. </w:t>
             </w:r>
             <w:r>
               <w:rPr>
@@ -450,7 +450,7 @@
                 <w:color w:val="464B52"/>
                 <w:sz w:val="20"/>
               </w:rPr>
-              <w:t xml:space="preserve"> are modifiers, not professions. The design that survives applies a pattern within one group, and two queries have to come back before it is built. Section 6.4.</w:t>
+              <w:t xml:space="preserve"> are modifiers, not professions. Section 6.4 has the measurement and what is still open.</w:t>
             </w:r>
           </w:p>
         </w:tc>
@@ -11525,7 +11525,7 @@
           <w:color w:val="1F6F6A"/>
           <w:sz w:val="25"/>
         </w:rPr>
-        <w:t>6.4  HEAD OF FACULTY — 17,528 people</w:t>
+        <w:t>6.4  HEAD OF FACULTY — 17,528 people, 19,026 after the next build</w:t>
       </w:r>
     </w:p>
     <w:p>
@@ -11853,7 +11853,7 @@
                 <w:color w:val="464B52"/>
                 <w:sz w:val="20"/>
               </w:rPr>
-              <w:t>The head and dean family, measured both ways.</w:t>
+              <w:t>The head and dean family, measured both ways and then shipped.</w:t>
             </w:r>
             <w:r>
               <w:rPr>
@@ -11862,7 +11862,7 @@
                 <w:color w:val="464B52"/>
                 <w:sz w:val="20"/>
               </w:rPr>
-              <w:t xml:space="preserve"> 3,683 people hold one:</w:t>
+              <w:t xml:space="preserve"> 1,706 titles over 48,995 records, held by 2,354 people:</w:t>
             </w:r>
           </w:p>
           <w:p>
@@ -11881,7 +11881,7 @@
                 <w:color w:val="1C1F23"/>
                 <w:sz w:val="19"/>
               </w:rPr>
-              <w:t>Lecturer loses      at most 1,739 of 399,884 people   0.43%</w:t>
+              <w:t>Lecturer           399,884  -&gt;  398,858      -0.26%</w:t>
             </w:r>
           </w:p>
           <w:p>
@@ -11895,7 +11895,7 @@
                 <w:color w:val="1C1F23"/>
                 <w:sz w:val="19"/>
               </w:rPr>
-              <w:t xml:space="preserve">                    the other 1,944 hold another teaching title and stay</w:t>
+              <w:t xml:space="preserve">                   1,026 leave; 1,328 hold another teaching title and stay</w:t>
             </w:r>
           </w:p>
           <w:p>
@@ -11909,7 +11909,7 @@
                 <w:color w:val="1C1F23"/>
                 <w:sz w:val="19"/>
               </w:rPr>
-              <w:t>Head of Faculty gains  up to 3,376 of 17,528 people    +19%</w:t>
+              <w:t>Head of Faculty     17,528  -&gt;   19,026      +8.5%</w:t>
             </w:r>
           </w:p>
           <w:p>
@@ -11923,7 +11923,7 @@
                 <w:color w:val="1C1F23"/>
                 <w:sz w:val="19"/>
               </w:rPr>
-              <w:t xml:space="preserve">                    3,263 of them reachable; 307 are already in it</w:t>
+              <w:t xml:space="preserve">                   1,498 new and confirmed; 280 already in; 543 no ROR match</w:t>
             </w:r>
           </w:p>
           <w:p>
@@ -11942,7 +11942,7 @@
                 <w:color w:val="464B52"/>
                 <w:sz w:val="20"/>
               </w:rPr>
-              <w:t>That is the best trade this audience has been offered.</w:t>
+              <w:t>The organisation does not block it</w:t>
             </w:r>
             <w:r>
               <w:rPr>
@@ -11951,25 +11951,7 @@
                 <w:color w:val="464B52"/>
                 <w:sz w:val="20"/>
               </w:rPr>
-              <w:t xml:space="preserve"> It is also an upper bound on the gain, because faculty_head still needs the organisation to resolve, and that is what already strands 14,600 strong leadership records. Query H in </w:t>
-            </w:r>
-            <w:r>
-              <w:rPr>
-                <w:rFonts w:ascii="Consolas" w:hAnsi="Consolas"/>
-                <w:b w:val="0"/>
-                <w:color w:val="1C1F23"/>
-                <w:sz w:val="19"/>
-              </w:rPr>
-              <w:t>analyses/30_leadership_compounds.sql</w:t>
-            </w:r>
-            <w:r>
-              <w:rPr>
-                <w:rFonts w:ascii="Calibri" w:hAnsi="Calibri"/>
-                <w:b w:val="0"/>
-                <w:color w:val="464B52"/>
-                <w:sz w:val="20"/>
-              </w:rPr>
-              <w:t xml:space="preserve"> is what decides it.</w:t>
+              <w:t>, which was the one thing that could have. 1,702 of the 2,354 are at an Education or Facility employer. What strands 14,600 strong leadership records elsewhere does not strand these, because a professor who also heads a department is at a university and the ROR resolves.</w:t>
             </w:r>
           </w:p>
         </w:tc>
@@ -12684,7 +12666,7 @@
                 <w:color w:val="1F6F6A"/>
                 <w:sz w:val="19"/>
               </w:rPr>
-              <w:t>THE DESIGN THAT SURVIVES, AND WHAT IT STILL NEEDS</w:t>
+              <w:t>WHAT SHIPPED — A PATTERN THAT APPLIES WITHIN ONE GROUP</w:t>
             </w:r>
           </w:p>
           <w:p>
@@ -12698,7 +12680,7 @@
                 <w:color w:val="464B52"/>
                 <w:sz w:val="20"/>
               </w:rPr>
-              <w:t xml:space="preserve">A pattern that applies </w:t>
+              <w:t xml:space="preserve">A pattern row can now say </w:t>
             </w:r>
             <w:r>
               <w:rPr>
@@ -12707,7 +12689,7 @@
                 <w:color w:val="464B52"/>
                 <w:sz w:val="20"/>
               </w:rPr>
-              <w:t>within one group</w:t>
+              <w:t>only when the model already put this title in teaching</w:t>
             </w:r>
             <w:r>
               <w:rPr>
@@ -12716,7 +12698,7 @@
                 <w:color w:val="464B52"/>
                 <w:sz w:val="20"/>
               </w:rPr>
-              <w:t>: a row that says "only when the model already put this title in teaching". Then —</w:t>
+              <w:t>. That removes the 14,500-record sweep by construction: practitioner, pharmacist and the researcher groups are never consulted. The three librarian collisions go the same way, the word-order split closes because a pattern matches every separator, and the profession word still wins.</w:t>
             </w:r>
           </w:p>
           <w:p>
@@ -12728,104 +12710,6 @@
             <w:pPr>
               <w:spacing w:after="40"/>
             </w:pPr>
-            <w:r>
-              <w:rPr>
-                <w:rFonts w:ascii="Calibri" w:hAnsi="Calibri"/>
-                <w:b w:val="0"/>
-                <w:color w:val="464B52"/>
-                <w:sz w:val="20"/>
-              </w:rPr>
-              <w:t>• the 14,500-record sweep disappears by construction, because practitioner, pharmacist and the researcher groups are never consulted;</w:t>
-            </w:r>
-          </w:p>
-          <w:p>
-            <w:pPr>
-              <w:spacing w:after="40"/>
-            </w:pPr>
-            <w:r>
-              <w:rPr>
-                <w:rFonts w:ascii="Calibri" w:hAnsi="Calibri"/>
-                <w:b w:val="0"/>
-                <w:color w:val="464B52"/>
-                <w:sz w:val="20"/>
-              </w:rPr>
-              <w:t>• so do the three librarian collisions the check turned up, for the same reason;</w:t>
-            </w:r>
-          </w:p>
-          <w:p>
-            <w:pPr>
-              <w:spacing w:after="40"/>
-            </w:pPr>
-            <w:r>
-              <w:rPr>
-                <w:rFonts w:ascii="Calibri" w:hAnsi="Calibri"/>
-                <w:b w:val="0"/>
-                <w:color w:val="464B52"/>
-                <w:sz w:val="20"/>
-              </w:rPr>
-              <w:t>• the word-order split still closes, because a pattern matches every separator;</w:t>
-            </w:r>
-          </w:p>
-          <w:p>
-            <w:pPr>
-              <w:spacing w:after="40"/>
-            </w:pPr>
-            <w:r>
-              <w:rPr>
-                <w:rFonts w:ascii="Calibri" w:hAnsi="Calibri"/>
-                <w:b w:val="0"/>
-                <w:color w:val="464B52"/>
-                <w:sz w:val="20"/>
-              </w:rPr>
-              <w:t>• and the profession word still wins, which is what was decided.</w:t>
-            </w:r>
-          </w:p>
-          <w:p>
-            <w:pPr>
-              <w:spacing w:after="40"/>
-            </w:pPr>
-          </w:p>
-          <w:p>
-            <w:pPr>
-              <w:spacing w:after="40"/>
-            </w:pPr>
-            <w:r>
-              <w:rPr>
-                <w:rFonts w:ascii="Calibri" w:hAnsi="Calibri"/>
-                <w:b w:val="0"/>
-                <w:color w:val="464B52"/>
-                <w:sz w:val="20"/>
-              </w:rPr>
-              <w:t>It is one nullable column on the pattern seed and one condition in one join, plus making the model's own choice visible so the two existing pattern tests can still see what a conditional pattern acted on. Librarian rows leave the column empty and go on working unchanged.</w:t>
-            </w:r>
-          </w:p>
-          <w:p>
-            <w:pPr>
-              <w:spacing w:after="40"/>
-            </w:pPr>
-          </w:p>
-          <w:p>
-            <w:pPr>
-              <w:spacing w:after="40"/>
-            </w:pPr>
-            <w:r>
-              <w:rPr>
-                <w:rFonts w:ascii="Calibri" w:hAnsi="Calibri"/>
-                <w:b/>
-                <w:color w:val="464B52"/>
-                <w:sz w:val="20"/>
-              </w:rPr>
-              <w:t>Two things are measured before it is built, and one of them could still cancel it.</w:t>
-            </w:r>
-            <w:r>
-              <w:rPr>
-                <w:rFonts w:ascii="Calibri" w:hAnsi="Calibri"/>
-                <w:b w:val="0"/>
-                <w:color w:val="464B52"/>
-                <w:sz w:val="20"/>
-              </w:rPr>
-              <w:t xml:space="preserve"> </w:t>
-            </w:r>
             <w:r>
               <w:rPr>
                 <w:rFonts w:ascii="Consolas" w:hAnsi="Consolas"/>
@@ -12833,17 +12717,13 @@
                 <w:color w:val="1C1F23"/>
                 <w:sz w:val="19"/>
               </w:rPr>
-              <w:t>analyses/30</w:t>
-            </w:r>
-            <w:r>
-              <w:rPr>
-                <w:rFonts w:ascii="Calibri" w:hAnsi="Calibri"/>
-                <w:b w:val="0"/>
-                <w:color w:val="464B52"/>
-                <w:sz w:val="20"/>
-              </w:rPr>
-              <w:t xml:space="preserve"> query I lists the exclusions — </w:t>
-            </w:r>
+              <w:t>10 patterns   head of department / school / faculty / institute / division,</w:t>
+            </w:r>
+          </w:p>
+          <w:p>
+            <w:pPr>
+              <w:spacing w:after="40"/>
+            </w:pPr>
             <w:r>
               <w:rPr>
                 <w:rFonts w:ascii="Consolas" w:hAnsi="Consolas"/>
@@ -12851,17 +12731,13 @@
                 <w:color w:val="1C1F23"/>
                 <w:sz w:val="19"/>
               </w:rPr>
-              <w:t>dean s chair</w:t>
-            </w:r>
-            <w:r>
-              <w:rPr>
-                <w:rFonts w:ascii="Calibri" w:hAnsi="Calibri"/>
-                <w:b w:val="0"/>
-                <w:color w:val="464B52"/>
-                <w:sz w:val="20"/>
-              </w:rPr>
-              <w:t xml:space="preserve">, </w:t>
-            </w:r>
+              <w:t xml:space="preserve">              head of the department, head of dept, dean, decano, dekan</w:t>
+            </w:r>
+          </w:p>
+          <w:p>
+            <w:pPr>
+              <w:spacing w:after="40"/>
+            </w:pPr>
             <w:r>
               <w:rPr>
                 <w:rFonts w:ascii="Consolas" w:hAnsi="Consolas"/>
@@ -12869,16 +12745,359 @@
                 <w:color w:val="1C1F23"/>
                 <w:sz w:val="19"/>
               </w:rPr>
-              <w:t>dean s clinical research fellow</w:t>
-            </w:r>
-            <w:r>
-              <w:rPr>
-                <w:rFonts w:ascii="Calibri" w:hAnsi="Calibri"/>
-                <w:b w:val="0"/>
+              <w:t>10 exclusions the possessives - dean s chair, college of science dean s</w:t>
+            </w:r>
+          </w:p>
+          <w:p>
+            <w:pPr>
+              <w:spacing w:after="40"/>
+            </w:pPr>
+            <w:r>
+              <w:rPr>
+                <w:rFonts w:ascii="Consolas" w:hAnsi="Consolas"/>
+                <w:b w:val="0"/>
+                <w:color w:val="1C1F23"/>
+                <w:sz w:val="19"/>
+              </w:rPr>
+              <w:t xml:space="preserve">              distinguished professor, dean s assistant full-time lecturer</w:t>
+            </w:r>
+          </w:p>
+          <w:p>
+            <w:pPr>
+              <w:spacing w:after="40"/>
+            </w:pPr>
+            <w:r>
+              <w:rPr>
+                <w:rFonts w:ascii="Consolas" w:hAnsi="Consolas"/>
+                <w:b w:val="0"/>
+                <w:color w:val="1C1F23"/>
+                <w:sz w:val="19"/>
+              </w:rPr>
+              <w:t xml:space="preserve"> 1 correction ... vice dean/ acting dean/ dean s advisor IS a deanship.</w:t>
+            </w:r>
+          </w:p>
+          <w:p>
+            <w:pPr>
+              <w:spacing w:after="40"/>
+            </w:pPr>
+            <w:r>
+              <w:rPr>
+                <w:rFonts w:ascii="Consolas" w:hAnsi="Consolas"/>
+                <w:b w:val="0"/>
+                <w:color w:val="1C1F23"/>
+                <w:sz w:val="19"/>
+              </w:rPr>
+              <w:t xml:space="preserve">              The exclusion regex had flagged it on the possessive alone</w:t>
+            </w:r>
+          </w:p>
+          <w:p>
+            <w:pPr>
+              <w:spacing w:after="40"/>
+            </w:pPr>
+            <w:r>
+              <w:rPr>
+                <w:rFonts w:ascii="Consolas" w:hAnsi="Consolas"/>
+                <w:b w:val="0"/>
+                <w:color w:val="1C1F23"/>
+                <w:sz w:val="19"/>
+              </w:rPr>
+              <w:t xml:space="preserve"> 3 decisions  the collision titles, all to librarian</w:t>
+            </w:r>
+          </w:p>
+          <w:p>
+            <w:pPr>
+              <w:spacing w:after="40"/>
+            </w:pPr>
+          </w:p>
+          <w:p>
+            <w:pPr>
+              <w:spacing w:after="40"/>
+            </w:pPr>
+            <w:r>
+              <w:rPr>
+                <w:rFonts w:ascii="Calibri" w:hAnsi="Calibri"/>
+                <w:b/>
                 <w:color w:val="464B52"/>
                 <w:sz w:val="20"/>
               </w:rPr>
-              <w:t>, a post carrying its own end date. Query J asks whether these people's employers resolve to an academic organisation at all: faculty_head scores Healthcare, Company, Funder and UNKNOWN at zero, so if they sit there the +19% is fiction and nothing should be changed.</w:t>
+              <w:t>Why the trade is defensible, and it is not that Head of Faculty is small.</w:t>
+            </w:r>
+            <w:r>
+              <w:rPr>
+                <w:rFonts w:ascii="Calibri" w:hAnsi="Calibri"/>
+                <w:b w:val="0"/>
+                <w:color w:val="464B52"/>
+                <w:sz w:val="20"/>
+              </w:rPr>
+              <w:t xml:space="preserve"> Under the one-title-one-profession rule something has to be dropped from </w:t>
+            </w:r>
+            <w:r>
+              <w:rPr>
+                <w:rFonts w:ascii="Consolas" w:hAnsi="Consolas"/>
+                <w:b w:val="0"/>
+                <w:color w:val="1C1F23"/>
+                <w:sz w:val="19"/>
+              </w:rPr>
+              <w:t>professor and head of department</w:t>
+            </w:r>
+            <w:r>
+              <w:rPr>
+                <w:rFonts w:ascii="Calibri" w:hAnsi="Calibri"/>
+                <w:b w:val="0"/>
+                <w:color w:val="464B52"/>
+                <w:sz w:val="20"/>
+              </w:rPr>
+              <w:t>, and the two readings are not equal: heading a department at a university entails being an academic there, while being a professor entails nothing about leading anything. The leadership reading keeps both facts; the teaching reading throws one away. That is an argument about what the title says.</w:t>
+            </w:r>
+          </w:p>
+        </w:tc>
+      </w:tr>
+    </w:tbl>
+    <w:p>
+      <w:pPr>
+        <w:spacing w:after="40"/>
+      </w:pPr>
+    </w:p>
+    <w:tbl>
+      <w:tblPr>
+        <w:tblW w:type="auto" w:w="0"/>
+        <w:jc w:val="left"/>
+        <w:tblLook w:firstColumn="1" w:firstRow="1" w:lastColumn="0" w:lastRow="0" w:noHBand="0" w:noVBand="1" w:val="04A0"/>
+        <w:tblBorders>
+          <w:top w:val="none" w:sz="0"/>
+          <w:left w:val="none" w:sz="0"/>
+          <w:bottom w:val="none" w:sz="0"/>
+          <w:right w:val="none" w:sz="0"/>
+          <w:insideH w:val="none" w:sz="0"/>
+          <w:insideV w:val="none" w:sz="0"/>
+        </w:tblBorders>
+      </w:tblPr>
+      <w:tblGrid>
+        <w:gridCol w:w="9648"/>
+      </w:tblGrid>
+      <w:tr>
+        <w:tc>
+          <w:tcPr>
+            <w:tcW w:type="dxa" w:w="9648"/>
+            <w:shd w:val="clear" w:fill="FDF8EF"/>
+          </w:tcPr>
+          <w:p>
+            <w:pPr>
+              <w:spacing w:after="60"/>
+            </w:pPr>
+            <w:r>
+              <w:rPr>
+                <w:rFonts w:ascii="Calibri" w:hAnsi="Calibri"/>
+                <w:b/>
+                <w:color w:val="8A6410"/>
+                <w:sz w:val="19"/>
+              </w:rPr>
+              <w:t>WHAT IS STILL NOT CERTAIN, AND IT IS SMALL</w:t>
+            </w:r>
+          </w:p>
+          <w:p>
+            <w:pPr>
+              <w:spacing w:after="40"/>
+            </w:pPr>
+            <w:r>
+              <w:rPr>
+                <w:rFonts w:ascii="Calibri" w:hAnsi="Calibri"/>
+                <w:b/>
+                <w:color w:val="464B52"/>
+                <w:sz w:val="20"/>
+              </w:rPr>
+              <w:t>One flaw was found while writing it and fixed before it shipped.</w:t>
+            </w:r>
+            <w:r>
+              <w:rPr>
+                <w:rFonts w:ascii="Calibri" w:hAnsi="Calibri"/>
+                <w:b w:val="0"/>
+                <w:color w:val="464B52"/>
+                <w:sz w:val="20"/>
+              </w:rPr>
+              <w:t xml:space="preserve"> The scope has to mean the model *assigned* that group, not merely that teaching was its nearest guess. The nearest group is recorded even for a title the model rejected as too weak, so conditioning on it would have promoted those titles with a perfect score — rescuing precisely what the confidence floor exists to hold back.</w:t>
+            </w:r>
+          </w:p>
+          <w:p>
+            <w:pPr>
+              <w:spacing w:after="40"/>
+            </w:pPr>
+          </w:p>
+          <w:p>
+            <w:pPr>
+              <w:spacing w:after="40"/>
+            </w:pPr>
+            <w:r>
+              <w:rPr>
+                <w:rFonts w:ascii="Calibri" w:hAnsi="Calibri"/>
+                <w:b/>
+                <w:color w:val="464B52"/>
+                <w:sz w:val="20"/>
+              </w:rPr>
+              <w:t>Two things the build will settle.</w:t>
+            </w:r>
+            <w:r>
+              <w:rPr>
+                <w:rFonts w:ascii="Calibri" w:hAnsi="Calibri"/>
+                <w:b w:val="0"/>
+                <w:color w:val="464B52"/>
+                <w:sz w:val="20"/>
+              </w:rPr>
+              <w:t xml:space="preserve"> A title that is teaching by human decision rather than by the model will not be claimed, which would show up as slightly fewer than 1,706 titles moving; there are 26 human decisions in that group and none of them is a head or dean compound, so this should be nil. And the four smallest patterns — </w:t>
+            </w:r>
+            <w:r>
+              <w:rPr>
+                <w:rFonts w:ascii="Consolas" w:hAnsi="Consolas"/>
+                <w:b w:val="0"/>
+                <w:color w:val="1C1F23"/>
+                <w:sz w:val="19"/>
+              </w:rPr>
+              <w:t>dekan</w:t>
+            </w:r>
+            <w:r>
+              <w:rPr>
+                <w:rFonts w:ascii="Calibri" w:hAnsi="Calibri"/>
+                <w:b w:val="0"/>
+                <w:color w:val="464B52"/>
+                <w:sz w:val="20"/>
+              </w:rPr>
+              <w:t xml:space="preserve"> with 2 titles, </w:t>
+            </w:r>
+            <w:r>
+              <w:rPr>
+                <w:rFonts w:ascii="Consolas" w:hAnsi="Consolas"/>
+                <w:b w:val="0"/>
+                <w:color w:val="1C1F23"/>
+                <w:sz w:val="19"/>
+              </w:rPr>
+              <w:t>head of dept</w:t>
+            </w:r>
+            <w:r>
+              <w:rPr>
+                <w:rFonts w:ascii="Calibri" w:hAnsi="Calibri"/>
+                <w:b w:val="0"/>
+                <w:color w:val="464B52"/>
+                <w:sz w:val="20"/>
+              </w:rPr>
+              <w:t xml:space="preserve"> and </w:t>
+            </w:r>
+            <w:r>
+              <w:rPr>
+                <w:rFonts w:ascii="Consolas" w:hAnsi="Consolas"/>
+                <w:b w:val="0"/>
+                <w:color w:val="1C1F23"/>
+                <w:sz w:val="19"/>
+              </w:rPr>
+              <w:t>decano</w:t>
+            </w:r>
+            <w:r>
+              <w:rPr>
+                <w:rFonts w:ascii="Calibri" w:hAnsi="Calibri"/>
+                <w:b w:val="0"/>
+                <w:color w:val="464B52"/>
+                <w:sz w:val="20"/>
+              </w:rPr>
+              <w:t xml:space="preserve"> with 4, </w:t>
+            </w:r>
+            <w:r>
+              <w:rPr>
+                <w:rFonts w:ascii="Consolas" w:hAnsi="Consolas"/>
+                <w:b w:val="0"/>
+                <w:color w:val="1C1F23"/>
+                <w:sz w:val="19"/>
+              </w:rPr>
+              <w:t>head of faculty</w:t>
+            </w:r>
+            <w:r>
+              <w:rPr>
+                <w:rFonts w:ascii="Calibri" w:hAnsi="Calibri"/>
+                <w:b w:val="0"/>
+                <w:color w:val="464B52"/>
+                <w:sz w:val="20"/>
+              </w:rPr>
+              <w:t xml:space="preserve"> with 6 — would fail the test that every pattern must match something, if even one of those few turns out to be a human decision. That failure is the guard working, and the fix is one word in a note.</w:t>
+            </w:r>
+          </w:p>
+          <w:p>
+            <w:pPr>
+              <w:spacing w:after="40"/>
+            </w:pPr>
+          </w:p>
+          <w:p>
+            <w:pPr>
+              <w:spacing w:after="40"/>
+            </w:pPr>
+            <w:r>
+              <w:rPr>
+                <w:rFonts w:ascii="Calibri" w:hAnsi="Calibri"/>
+                <w:b/>
+                <w:color w:val="464B52"/>
+                <w:sz w:val="20"/>
+              </w:rPr>
+              <w:t>And one known residual: 26 titles, 604 records, 1.2% of the scope.</w:t>
+            </w:r>
+            <w:r>
+              <w:rPr>
+                <w:rFonts w:ascii="Calibri" w:hAnsi="Calibri"/>
+                <w:b w:val="0"/>
+                <w:color w:val="464B52"/>
+                <w:sz w:val="20"/>
+              </w:rPr>
+              <w:t xml:space="preserve"> They carry their own dates, and a date is not a rule — </w:t>
+            </w:r>
+            <w:r>
+              <w:rPr>
+                <w:rFonts w:ascii="Consolas" w:hAnsi="Consolas"/>
+                <w:b w:val="0"/>
+                <w:color w:val="1C1F23"/>
+                <w:sz w:val="19"/>
+              </w:rPr>
+              <w:t>dean 2010-2018</w:t>
+            </w:r>
+            <w:r>
+              <w:rPr>
+                <w:rFonts w:ascii="Calibri" w:hAnsi="Calibri"/>
+                <w:b w:val="0"/>
+                <w:color w:val="464B52"/>
+                <w:sz w:val="20"/>
+              </w:rPr>
+              <w:t xml:space="preserve"> has ended, </w:t>
+            </w:r>
+            <w:r>
+              <w:rPr>
+                <w:rFonts w:ascii="Consolas" w:hAnsi="Consolas"/>
+                <w:b w:val="0"/>
+                <w:color w:val="1C1F23"/>
+                <w:sz w:val="19"/>
+              </w:rPr>
+              <w:t>dean 2014-</w:t>
+            </w:r>
+            <w:r>
+              <w:rPr>
+                <w:rFonts w:ascii="Calibri" w:hAnsi="Calibri"/>
+                <w:b w:val="0"/>
+                <w:color w:val="464B52"/>
+                <w:sz w:val="20"/>
+              </w:rPr>
+              <w:t xml:space="preserve"> and </w:t>
+            </w:r>
+            <w:r>
+              <w:rPr>
+                <w:rFonts w:ascii="Consolas" w:hAnsi="Consolas"/>
+                <w:b w:val="0"/>
+                <w:color w:val="1C1F23"/>
+                <w:sz w:val="19"/>
+              </w:rPr>
+              <w:t>head of department 1997-pres</w:t>
+            </w:r>
+            <w:r>
+              <w:rPr>
+                <w:rFonts w:ascii="Calibri" w:hAnsi="Calibri"/>
+                <w:b w:val="0"/>
+                <w:color w:val="464B52"/>
+                <w:sz w:val="20"/>
+              </w:rPr>
+              <w:t xml:space="preserve"> have not, and one title carries both ranges with the headship on the open side. Query L lists all 26 to be read rather than regexed.</w:t>
             </w:r>
           </w:p>
         </w:tc>

</xml_diff>